<commit_message>
Balance 34 video Sessions; fix installation and safe exit; add verified material download
</commit_message>
<xml_diff>
--- a/docs/视频EEG_实验说明.docx
+++ b/docs/视频EEG_实验说明.docx
@@ -87,7 +87,7 @@
         <w:pStyle w:val="Normal"/>
       </w:pPr>
       <w:r>
-        <w:t xml:space="preserve">正式实验为 7949 段，固定分配到 17 个 Session，每组 467 或 468 段。分组由版本化 CSV 确定，</w:t>
+        <w:t xml:space="preserve">正式实验为 7949 段，固定分配到 34 个 Session，每组 233–235 段。分组由版本化 CSV 确定，</w:t>
       </w:r>
     </w:p>
     <w:p>
@@ -156,6 +156,38 @@
     </w:p>
     <w:p>
       <w:pPr>
+        <w:pStyle w:val="Normal"/>
+      </w:pPr>
+      <w:r>
+        <w:t xml:space="preserve">材料通过 统一版本化 Release (https://github.com/18yiba/visual-video-task/releases/tag/materials-v1-20260910)</w:t>
+      </w:r>
+    </w:p>
+    <w:p>
+      <w:pPr>
+        <w:pStyle w:val="Normal"/>
+      </w:pPr>
+      <w:r>
+        <w:t xml:space="preserve">分包分发。安装环境后运行 download_materials.bat 下载至 stimuli/videos 并验证每段视频的 SHA-256。</w:t>
+      </w:r>
+    </w:p>
+    <w:p>
+      <w:pPr>
+        <w:pStyle w:val="Normal"/>
+      </w:pPr>
+      <w:r>
+        <w:t xml:space="preserve">固定分组、题库和材料清单必须使用同一版本；部署步骤见 视频库下载说明 (MATERIALS_DOWNLOAD.zh-CN.md)。</w:t>
+      </w:r>
+    </w:p>
+    <w:p>
+      <w:pPr>
+        <w:pStyle w:val="Normal"/>
+      </w:pPr>
+      <w:r>
+        <w:t xml:space="preserve"/>
+      </w:r>
+    </w:p>
+    <w:p>
+      <w:pPr>
         <w:pStyle w:val="Heading1"/>
       </w:pPr>
       <w:r>
@@ -399,7 +431,7 @@
         <w:pStyle w:val="Normal"/>
       </w:pPr>
       <w:r>
-        <w:t xml:space="preserve">当前常用入口使用 data/video_question_complete_runs；旧 2779 题正式入口的进度保留在</w:t>
+        <w:t xml:space="preserve">当前常用入口使用 data/video_question_complete_runs/protocol_34sessions；旧 2779 题正式入口的进度保留在</w:t>
       </w:r>
     </w:p>
     <w:p>
@@ -616,6 +648,166 @@
       </w:pPr>
       <w:r>
         <w:t xml:space="preserve">真实硬件的电极接触、实际采样率、信号质量及刺激至采集的物理延迟仍需主试在实验设备上验证。</w:t>
+      </w:r>
+    </w:p>
+    <w:p>
+      <w:pPr>
+        <w:pStyle w:val="Normal"/>
+      </w:pPr>
+      <w:r>
+        <w:t xml:space="preserve"/>
+      </w:r>
+    </w:p>
+    <w:p>
+      <w:pPr>
+        <w:pStyle w:val="Heading1"/>
+      </w:pPr>
+      <w:r>
+        <w:t xml:space="preserve">当前 34 组与旧 17 组</w:t>
+      </w:r>
+    </w:p>
+    <w:p>
+      <w:pPr>
+        <w:pStyle w:val="Normal"/>
+      </w:pPr>
+      <w:r>
+        <w:t xml:space="preserve"/>
+      </w:r>
+    </w:p>
+    <w:p>
+      <w:pPr>
+        <w:pStyle w:val="Normal"/>
+      </w:pPr>
+      <w:r>
+        <w:t xml:space="preserve">7949 段正式视频总净时长约 50.30 小时。新分组每组 88.35–88.94 分钟，平均 88.76 分钟，</w:t>
+      </w:r>
+    </w:p>
+    <w:p>
+      <w:pPr>
+        <w:pStyle w:val="Normal"/>
+      </w:pPr>
+      <w:r>
+        <w:t xml:space="preserve">每组 233–235 段，五档视频各至少 46 段；全库正式视频范围约 5.107–59.976 秒。</w:t>
+      </w:r>
+    </w:p>
+    <w:p>
+      <w:pPr>
+        <w:pStyle w:val="Normal"/>
+      </w:pPr>
+      <w:r>
+        <w:t xml:space="preserve">每个原 Session 按五档时长均衡拆为两半，原 n 对应新 2n−1 和 2n。各组内部随机播放；</w:t>
+      </w:r>
+    </w:p>
+    <w:p>
+      <w:pPr>
+        <w:pStyle w:val="Normal"/>
+      </w:pPr>
+      <w:r>
+        <w:t xml:space="preserve">播放顺序和 18 个抽查目标在开始时保存，续跑不重新抽签。没有 90 分钟强制停止。</w:t>
+      </w:r>
+    </w:p>
+    <w:p>
+      <w:pPr>
+        <w:pStyle w:val="Normal"/>
+      </w:pPr>
+      <w:r>
+        <w:t xml:space="preserve">注视点、视频间隔、答题及休息不计入净观看，实际占用时间会更长。</w:t>
+      </w:r>
+    </w:p>
+    <w:p>
+      <w:pPr>
+        <w:pStyle w:val="Normal"/>
+      </w:pPr>
+      <w:r>
+        <w:t xml:space="preserve"/>
+      </w:r>
+    </w:p>
+    <w:p>
+      <w:pPr>
+        <w:pStyle w:val="Normal"/>
+      </w:pPr>
+      <w:r>
+        <w:t xml:space="preserve">当前权威分组为 video_eeg/config/session_manifest_34.csv。</w:t>
+      </w:r>
+    </w:p>
+    <w:p>
+      <w:pPr>
+        <w:pStyle w:val="Normal"/>
+      </w:pPr>
+      <w:r>
+        <w:t xml:space="preserve">旧 session_manifest.csv 保留原 17 组，不能用新文件覆盖旧文件。</w:t>
+      </w:r>
+    </w:p>
+    <w:p>
+      <w:pPr>
+        <w:pStyle w:val="Normal"/>
+      </w:pPr>
+      <w:r>
+        <w:t xml:space="preserve">旧完整版 17 组请用 run_video_legacy_17.bat，其数据仍在 data/video_question_complete_runs/&lt;subject&gt;。</w:t>
+      </w:r>
+    </w:p>
+    <w:p>
+      <w:pPr>
+        <w:pStyle w:val="Normal"/>
+      </w:pPr>
+      <w:r>
+        <w:t xml:space="preserve">新默认入口用 data/video_question_complete_runs/protocol_34sessions/&lt;subject&gt;，避免同编号读到旧状态。</w:t>
+      </w:r>
+    </w:p>
+    <w:p>
+      <w:pPr>
+        <w:pStyle w:val="Normal"/>
+      </w:pPr>
+      <w:r>
+        <w:t xml:space="preserve">不自动迁移已开始的旧 Session，不把旧完成进度强行当作新分组的完成进度。</w:t>
+      </w:r>
+    </w:p>
+    <w:p>
+      <w:pPr>
+        <w:pStyle w:val="Normal"/>
+      </w:pPr>
+      <w:r>
+        <w:t xml:space="preserve"/>
+      </w:r>
+    </w:p>
+    <w:p>
+      <w:pPr>
+        <w:pStyle w:val="Normal"/>
+      </w:pPr>
+      <w:r>
+        <w:t xml:space="preserve">video_eeg/config/video_question_labels.csv 是 7996 段视频的完整标签对照表；</w:t>
+      </w:r>
+    </w:p>
+    <w:p>
+      <w:pPr>
+        <w:pStyle w:val="Normal"/>
+      </w:pPr>
+      <w:r>
+        <w:t xml:space="preserve">包含 SHA-256、题干、选项、答案、复核状态、session_34 和 legacy_session_17。</w:t>
+      </w:r>
+    </w:p>
+    <w:p>
+      <w:pPr>
+        <w:pStyle w:val="Normal"/>
+      </w:pPr>
+      <w:r>
+        <w:t xml:space="preserve">Release 的 material_metadata.zip 也包含此表。题目经 video_file 文件名关联，未嵌入 MP4 画面或字幕。</w:t>
+      </w:r>
+    </w:p>
+    <w:p>
+      <w:pPr>
+        <w:pStyle w:val="Normal"/>
+      </w:pPr>
+      <w:r>
+        <w:t xml:space="preserve">原题库可能保留历史 session_id，当前分组以 34 组清单和标签表的 session_34 列为准。</w:t>
+      </w:r>
+    </w:p>
+    <w:p>
+      <w:pPr>
+        <w:pStyle w:val="Normal"/>
+      </w:pPr>
+      <w:r>
+        <w:t xml:space="preserve">详见 34 组与标签审计 (SESSION_34_AND_LABEL_AUDIT.zh-CN.md)。</w:t>
       </w:r>
     </w:p>
     <w:sectPr>

</xml_diff>

<commit_message>
Document emotion protocol, offline materials, validation and separate Windows entries
</commit_message>
<xml_diff>
--- a/docs/视频EEG_实验说明.docx
+++ b/docs/视频EEG_实验说明.docx
@@ -2,6 +2,126 @@
 <file path=word/document.xml><?xml version="1.0" encoding="utf-8"?>
 <w:document xmlns:w="http://schemas.openxmlformats.org/wordprocessingml/2006/main">
   <w:body>
+    <w:p>
+      <w:pPr>
+        <w:pStyle w:val="Title"/>
+      </w:pPr>
+      <w:r>
+        <w:t xml:space="preserve">Emotion EEG v1 实验说明</w:t>
+      </w:r>
+    </w:p>
+    <w:p>
+      <w:pPr>
+        <w:pStyle w:val="Normal"/>
+      </w:pPr>
+      <w:r>
+        <w:t xml:space="preserve"/>
+      </w:r>
+    </w:p>
+    <w:p>
+      <w:pPr>
+        <w:pStyle w:val="Normal"/>
+      </w:pPr>
+      <w:r>
+        <w:t xml:space="preserve">本实验在连续观看视频时记录 EEG，并在每段情绪视频后依次报告自身情绪感受（Valence）和唤醒程度（Arousal）。</w:t>
+      </w:r>
+    </w:p>
+    <w:p>
+      <w:pPr>
+        <w:pStyle w:val="Normal"/>
+      </w:pPr>
+      <w:r>
+        <w:t xml:space="preserve">每项为 1–9 整数、键盘选择、不限时。刺激类别只用于材料分组，不向被试显示；不存在正确答案或准确率。</w:t>
+      </w:r>
+    </w:p>
+    <w:p>
+      <w:pPr>
+        <w:pStyle w:val="Normal"/>
+      </w:pPr>
+      <w:r>
+        <w:t xml:space="preserve">普通视频后无评分。新协议共 45 组，每组正/中/负数量相等，净视频约 90 分钟，评分和休息另计。</w:t>
+      </w:r>
+    </w:p>
+    <w:p>
+      <w:pPr>
+        <w:pStyle w:val="Normal"/>
+      </w:pPr>
+      <w:r>
+        <w:t xml:space="preserve">视频、评分及休息期间 EEG 保持连续；S/Esc/J、长短休息及恢复机制沿用主框架并适配评分的完整提交。</w:t>
+      </w:r>
+    </w:p>
+    <w:p>
+      <w:pPr>
+        <w:pStyle w:val="Normal"/>
+      </w:pPr>
+      <w:r>
+        <w:t xml:space="preserve"/>
+      </w:r>
+    </w:p>
+    <w:p>
+      <w:pPr>
+        <w:pStyle w:val="Normal"/>
+      </w:pPr>
+      <w:r>
+        <w:t xml:space="preserve">详见 完整协议 (EMOTION_EEG_PROTOCOL.zh-CN.md)、心理学依据及页面原文 (EMOTION_RATING_RATIONALE.md)。</w:t>
+      </w:r>
+    </w:p>
+    <w:p>
+      <w:pPr>
+        <w:pStyle w:val="Normal"/>
+      </w:pPr>
+      <w:r>
+        <w:t xml:space="preserve"/>
+      </w:r>
+    </w:p>
+    <w:p>
+      <w:pPr>
+        <w:pStyle w:val="Normal"/>
+      </w:pPr>
+      <w:r>
+        <w:t xml:space="preserve">---</w:t>
+      </w:r>
+    </w:p>
+    <w:p>
+      <w:pPr>
+        <w:pStyle w:val="Normal"/>
+      </w:pPr>
+      <w:r>
+        <w:t xml:space="preserve"/>
+      </w:r>
+    </w:p>
+    <w:p>
+      <w:pPr>
+        <w:pStyle w:val="Heading1"/>
+      </w:pPr>
+      <w:r>
+        <w:t xml:space="preserve">旧内容抽查协议说明（仅供历史数据解释）</w:t>
+      </w:r>
+    </w:p>
+    <w:p>
+      <w:pPr>
+        <w:pStyle w:val="Normal"/>
+      </w:pPr>
+      <w:r>
+        <w:t xml:space="preserve"/>
+      </w:r>
+    </w:p>
+    <w:p>
+      <w:pPr>
+        <w:pStyle w:val="Normal"/>
+      </w:pPr>
+      <w:r>
+        <w:t xml:space="preserve">以下不适用于 Emotion EEG v1 新采集。</w:t>
+      </w:r>
+    </w:p>
+    <w:p>
+      <w:pPr>
+        <w:pStyle w:val="Normal"/>
+      </w:pPr>
+      <w:r>
+        <w:t xml:space="preserve"/>
+      </w:r>
+    </w:p>
     <w:p>
       <w:pPr>
         <w:pStyle w:val="Title"/>

</xml_diff>